<commit_message>
Ajout ressources sur git
</commit_message>
<xml_diff>
--- a/public/downloads/kit-animateur/slides-animateur/module-1-notes.docx
+++ b/public/downloads/kit-animateur/slides-animateur/module-1-notes.docx
@@ -357,7 +357,7 @@
                 <w:sz w:val="20"/>
                 <w:szCs w:val="20"/>
               </w:rPr>
-              <w:t xml:space="preserve">3 — 4 outils, 4 usages</w:t>
+              <w:t xml:space="preserve">3 — 5 outils, 5 usages</w:t>
             </w:r>
           </w:p>
         </w:tc>
@@ -389,7 +389,7 @@
                 <w:sz w:val="21"/>
                 <w:szCs w:val="21"/>
               </w:rPr>
-              <w:t xml:space="preserve">Ne pas lire la liste — la commenter avec un exemple pour CHAQUE outil, pris dans le sondage du chat de la reconnexion si possible ("vous, en compta, Claude.ai vous suffit pour 90% de votre travail ; mais dès que vous voulez UN FICHIER livrable, on passe à Claude Code").</w:t>
+              <w:t xml:space="preserve">Ne pas lire la liste — la commenter avec un exemple pour CHAQUE outil, pris dans le sondage du chat de la reconnexion si possible ("vous, en compta, Claude.ai vous suffit pour 90% de votre travail ; mais dès que vous voulez UN FICHIER livrable, on passe à Claude Code" ; pour Claude Design, prendre l'exemple d'une maquette de landing page à montrer à un client avant de la développer).</w:t>
             </w:r>
           </w:p>
         </w:tc>

</xml_diff>